<commit_message>
docs: strictly adhere to SWD392 template by removing non-templated swimlanes and keeping 7 mandatory architectural diagrams
</commit_message>
<xml_diff>
--- a/docs/Software_Architecture_Design_Report_AIVES_Group3_EN.docx
+++ b/docs/Software_Architecture_Design_Report_AIVES_Group3_EN.docx
@@ -138,73 +138,18 @@
         <w:spacing w:before="60" w:after="80" w:line="276" w:lineRule="auto"/>
         <w:jc w:val="center"/>
       </w:pPr>
-      <w:r>
-        <w:rPr>
-          <w:noProof/>
-        </w:rPr>
-        <w:lastRenderedPageBreak/>
-        <w:drawing>
-          <wp:inline distT="0" distB="0" distL="0" distR="0" wp14:anchorId="0A48947F" wp14:editId="303911FB">
-            <wp:extent cx="4352290" cy="8229600"/>
-            <wp:effectExtent l="0" t="0" r="0" b="0"/>
-            <wp:docPr id="1120179214" name="Picture 3"/>
-            <wp:cNvGraphicFramePr>
-              <a:graphicFrameLocks xmlns:a="http://schemas.openxmlformats.org/drawingml/2006/main" noChangeAspect="1"/>
-            </wp:cNvGraphicFramePr>
-            <a:graphic xmlns:a="http://schemas.openxmlformats.org/drawingml/2006/main">
-              <a:graphicData uri="http://schemas.openxmlformats.org/drawingml/2006/picture">
-                <pic:pic xmlns:pic="http://schemas.openxmlformats.org/drawingml/2006/picture">
-                  <pic:nvPicPr>
-                    <pic:cNvPr id="1120179214" name=""/>
-                    <pic:cNvPicPr/>
-                  </pic:nvPicPr>
-                  <pic:blipFill>
-                    <a:blip r:embed="rId5">
-                      <a:extLst>
-                        <a:ext uri="{28A0092B-C50C-407E-A947-70E740481C1C}">
-                          <a14:useLocalDpi xmlns:a14="http://schemas.microsoft.com/office/drawing/2010/main" val="0"/>
-                        </a:ext>
-                      </a:extLst>
-                    </a:blip>
-                    <a:stretch>
-                      <a:fillRect/>
-                    </a:stretch>
-                  </pic:blipFill>
-                  <pic:spPr>
-                    <a:xfrm>
-                      <a:off x="0" y="0"/>
-                      <a:ext cx="4352290" cy="8229600"/>
-                    </a:xfrm>
-                    <a:prstGeom prst="rect">
-                      <a:avLst/>
-                    </a:prstGeom>
-                  </pic:spPr>
-                </pic:pic>
-              </a:graphicData>
-            </a:graphic>
-          </wp:inline>
-        </w:drawing>
-      </w:r>
     </w:p>
     <w:p>
       <w:pPr>
         <w:spacing w:before="60" w:after="80" w:line="276" w:lineRule="auto"/>
         <w:jc w:val="center"/>
-        <w:rPr>
-          <w:rFonts w:ascii="Calibri" w:hAnsi="Calibri" w:cs="Calibri"/>
-          <w:i/>
-          <w:color w:val="000000"/>
-          <w:sz w:val="19"/>
-        </w:rPr>
-      </w:pPr>
-      <w:r>
-        <w:rPr>
-          <w:rFonts w:ascii="Calibri" w:hAnsi="Calibri" w:cs="Calibri"/>
-          <w:i/>
-          <w:color w:val="000000"/>
-          <w:sz w:val="19"/>
-        </w:rPr>
-        <w:t>Figure 6.1: Workflow 1 - Question Bank Management and Rubric Standardization Swimlane</w:t>
+      </w:pPr>
+      <w:r>
+        <w:t>6</w:t>
+      </w:r>
+      <w:r>
+        <w:lastRenderedPageBreak/>
+        <w:t>.2 Workflow 2: Real-Time AI Viva Examination Room (Target Milestone 4 Flow)</w:t>
       </w:r>
     </w:p>
     <w:p>
@@ -218,182 +163,21 @@
         <w:spacing w:before="60" w:after="80" w:line="276" w:lineRule="auto"/>
         <w:jc w:val="center"/>
       </w:pPr>
-      <w:r>
-        <w:t>6.2 Workflow 2: Real-Time AI Viva Examination Room (Target Milestone 4 Flow)</w:t>
-      </w:r>
     </w:p>
     <w:p>
       <w:pPr>
         <w:spacing w:before="60" w:after="80" w:line="276" w:lineRule="auto"/>
         <w:jc w:val="center"/>
       </w:pPr>
+      <w:r>
+        <w:t>6.3 Workflow 3: AI Rubric Scoring and Human-in-the-Loop Approval (Target Milestone 4 Flow)</w:t>
+      </w:r>
     </w:p>
     <w:p>
       <w:pPr>
         <w:spacing w:before="60" w:after="80" w:line="276" w:lineRule="auto"/>
         <w:jc w:val="center"/>
       </w:pPr>
-      <w:r>
-        <w:rPr>
-          <w:noProof/>
-        </w:rPr>
-        <w:drawing>
-          <wp:inline distT="0" distB="0" distL="0" distR="0" wp14:anchorId="1AC386FB" wp14:editId="472D1113">
-            <wp:extent cx="4034155" cy="8229600"/>
-            <wp:effectExtent l="0" t="0" r="4445" b="0"/>
-            <wp:docPr id="929329048" name="Picture 4"/>
-            <wp:cNvGraphicFramePr>
-              <a:graphicFrameLocks xmlns:a="http://schemas.openxmlformats.org/drawingml/2006/main" noChangeAspect="1"/>
-            </wp:cNvGraphicFramePr>
-            <a:graphic xmlns:a="http://schemas.openxmlformats.org/drawingml/2006/main">
-              <a:graphicData uri="http://schemas.openxmlformats.org/drawingml/2006/picture">
-                <pic:pic xmlns:pic="http://schemas.openxmlformats.org/drawingml/2006/picture">
-                  <pic:nvPicPr>
-                    <pic:cNvPr id="929329048" name=""/>
-                    <pic:cNvPicPr/>
-                  </pic:nvPicPr>
-                  <pic:blipFill>
-                    <a:blip r:embed="rId6" cstate="print">
-                      <a:extLst>
-                        <a:ext uri="{28A0092B-C50C-407E-A947-70E740481C1C}">
-                          <a14:useLocalDpi xmlns:a14="http://schemas.microsoft.com/office/drawing/2010/main" val="0"/>
-                        </a:ext>
-                      </a:extLst>
-                    </a:blip>
-                    <a:stretch>
-                      <a:fillRect/>
-                    </a:stretch>
-                  </pic:blipFill>
-                  <pic:spPr>
-                    <a:xfrm>
-                      <a:off x="0" y="0"/>
-                      <a:ext cx="4034155" cy="8229600"/>
-                    </a:xfrm>
-                    <a:prstGeom prst="rect">
-                      <a:avLst/>
-                    </a:prstGeom>
-                  </pic:spPr>
-                </pic:pic>
-              </a:graphicData>
-            </a:graphic>
-          </wp:inline>
-        </w:drawing>
-      </w:r>
-    </w:p>
-    <w:p>
-      <w:pPr>
-        <w:spacing w:before="60" w:after="80" w:line="276" w:lineRule="auto"/>
-        <w:jc w:val="center"/>
-        <w:rPr>
-          <w:rFonts w:ascii="Calibri" w:hAnsi="Calibri" w:cs="Calibri"/>
-          <w:i/>
-          <w:color w:val="000000"/>
-          <w:sz w:val="19"/>
-        </w:rPr>
-      </w:pPr>
-      <w:r>
-        <w:rPr>
-          <w:rFonts w:ascii="Calibri" w:hAnsi="Calibri" w:cs="Calibri"/>
-          <w:i/>
-          <w:color w:val="000000"/>
-          <w:sz w:val="19"/>
-        </w:rPr>
-        <w:t>Figure 6.2: Workflow 2 - Real-Time AI Viva Examination Room Swimlane</w:t>
-      </w:r>
-    </w:p>
-    <w:p>
-      <w:pPr>
-        <w:spacing w:before="60" w:after="80" w:line="276" w:lineRule="auto"/>
-        <w:jc w:val="center"/>
-      </w:pPr>
-    </w:p>
-    <w:p>
-      <w:pPr>
-        <w:spacing w:before="60" w:after="80" w:line="276" w:lineRule="auto"/>
-        <w:jc w:val="center"/>
-      </w:pPr>
-      <w:r>
-        <w:t>6.3 Workflow 3: AI Rubric Scoring and Human-in-the-Loop Approval (Target Milestone 4 Flow)</w:t>
-      </w:r>
-    </w:p>
-    <w:p>
-      <w:pPr>
-        <w:spacing w:before="60" w:after="80" w:line="276" w:lineRule="auto"/>
-        <w:jc w:val="center"/>
-      </w:pPr>
-    </w:p>
-    <w:p>
-      <w:pPr>
-        <w:spacing w:before="60" w:after="80" w:line="276" w:lineRule="auto"/>
-        <w:jc w:val="center"/>
-      </w:pPr>
-      <w:r>
-        <w:rPr>
-          <w:noProof/>
-        </w:rPr>
-        <w:drawing>
-          <wp:inline distT="0" distB="0" distL="0" distR="0" wp14:anchorId="3C8F85F8" wp14:editId="5E503C7B">
-            <wp:extent cx="3761105" cy="8229600"/>
-            <wp:effectExtent l="0" t="0" r="0" b="0"/>
-            <wp:docPr id="1138254386" name="Picture 5"/>
-            <wp:cNvGraphicFramePr>
-              <a:graphicFrameLocks xmlns:a="http://schemas.openxmlformats.org/drawingml/2006/main" noChangeAspect="1"/>
-            </wp:cNvGraphicFramePr>
-            <a:graphic xmlns:a="http://schemas.openxmlformats.org/drawingml/2006/main">
-              <a:graphicData uri="http://schemas.openxmlformats.org/drawingml/2006/picture">
-                <pic:pic xmlns:pic="http://schemas.openxmlformats.org/drawingml/2006/picture">
-                  <pic:nvPicPr>
-                    <pic:cNvPr id="1138254386" name=""/>
-                    <pic:cNvPicPr/>
-                  </pic:nvPicPr>
-                  <pic:blipFill>
-                    <a:blip r:embed="rId7" cstate="print">
-                      <a:extLst>
-                        <a:ext uri="{28A0092B-C50C-407E-A947-70E740481C1C}">
-                          <a14:useLocalDpi xmlns:a14="http://schemas.microsoft.com/office/drawing/2010/main" val="0"/>
-                        </a:ext>
-                      </a:extLst>
-                    </a:blip>
-                    <a:stretch>
-                      <a:fillRect/>
-                    </a:stretch>
-                  </pic:blipFill>
-                  <pic:spPr>
-                    <a:xfrm>
-                      <a:off x="0" y="0"/>
-                      <a:ext cx="3761105" cy="8229600"/>
-                    </a:xfrm>
-                    <a:prstGeom prst="rect">
-                      <a:avLst/>
-                    </a:prstGeom>
-                  </pic:spPr>
-                </pic:pic>
-              </a:graphicData>
-            </a:graphic>
-          </wp:inline>
-        </w:drawing>
-      </w:r>
-    </w:p>
-    <w:p>
-      <w:pPr>
-        <w:spacing w:before="60" w:after="80" w:line="276" w:lineRule="auto"/>
-        <w:jc w:val="center"/>
-        <w:rPr>
-          <w:rFonts w:ascii="Calibri" w:hAnsi="Calibri" w:cs="Calibri"/>
-          <w:i/>
-          <w:color w:val="000000"/>
-          <w:sz w:val="19"/>
-        </w:rPr>
-      </w:pPr>
-      <w:r>
-        <w:rPr>
-          <w:rFonts w:ascii="Calibri" w:hAnsi="Calibri" w:cs="Calibri"/>
-          <w:i/>
-          <w:color w:val="000000"/>
-          <w:sz w:val="19"/>
-        </w:rPr>
-        <w:t>Figure 6.3: Workflow 3 - AI Grading and Human-in-the-Loop Approval Swimlane</w:t>
-      </w:r>
     </w:p>
     <w:p>
       <w:pPr>
@@ -622,7 +406,6 @@
           <w:b/>
           <w:color w:val="000000"/>
         </w:rPr>
-        <w:lastRenderedPageBreak/>
         <w:t xml:space="preserve">• Sovereign Lecturer Final Authority: </w:t>
       </w:r>
       <w:r>
@@ -1150,7 +933,6 @@
               <w:rPr>
                 <w:sz w:val="19"/>
               </w:rPr>
-              <w:lastRenderedPageBreak/>
               <w:t>FR-05</w:t>
             </w:r>
           </w:p>
@@ -1650,11 +1432,7 @@
         <w:t xml:space="preserve">• Phase 2 — Architectural Baseline &amp; Flow 1 (Milestone 2 &amp; 3): </w:t>
       </w:r>
       <w:r>
-        <w:t xml:space="preserve">Enterprise Onion Architecture configuration on .NET 10; implementation of Flow 1 (Question Bank &amp; </w:t>
-      </w:r>
-      <w:r>
-        <w:lastRenderedPageBreak/>
-        <w:t>Rubric Matrix with 100% weight validation, batch import, and Gemini AI synthesis); automated test suite implementation.</w:t>
+        <w:t>Enterprise Onion Architecture configuration on .NET 10; implementation of Flow 1 (Question Bank &amp; Rubric Matrix with 100% weight validation, batch import, and Gemini AI synthesis); automated test suite implementation.</w:t>
       </w:r>
     </w:p>
     <w:p>
@@ -1828,7 +1606,6 @@
           <w:b/>
           <w:color w:val="000000"/>
         </w:rPr>
-        <w:lastRenderedPageBreak/>
         <w:t xml:space="preserve">• Client Presentation Node: </w:t>
       </w:r>
       <w:r>
@@ -1931,7 +1708,7 @@
                     <pic:cNvPicPr/>
                   </pic:nvPicPr>
                   <pic:blipFill>
-                    <a:blip r:embed="rId8">
+                    <a:blip r:embed="rId5">
                       <a:extLst>
                         <a:ext uri="{28A0092B-C50C-407E-A947-70E740481C1C}">
                           <a14:useLocalDpi xmlns:a14="http://schemas.microsoft.com/office/drawing/2010/main" val="0"/>
@@ -2035,7 +1812,6 @@
                 <w:color w:val="000000"/>
                 <w:sz w:val="20"/>
               </w:rPr>
-              <w:lastRenderedPageBreak/>
               <w:t>System Component</w:t>
             </w:r>
           </w:p>
@@ -3034,7 +2810,6 @@
           <w:color w:val="000000"/>
           <w:sz w:val="34"/>
         </w:rPr>
-        <w:lastRenderedPageBreak/>
         <w:t>5. Requirements Modeling</w:t>
       </w:r>
     </w:p>
@@ -3238,7 +3013,7 @@
                     <pic:cNvPicPr/>
                   </pic:nvPicPr>
                   <pic:blipFill>
-                    <a:blip r:embed="rId9">
+                    <a:blip r:embed="rId6">
                       <a:extLst>
                         <a:ext uri="{28A0092B-C50C-407E-A947-70E740481C1C}">
                           <a14:useLocalDpi xmlns:a14="http://schemas.microsoft.com/office/drawing/2010/main" val="0"/>
@@ -3324,12 +3099,6 @@
         <w:gridCol w:w="2800"/>
       </w:tblGrid>
       <w:tr>
-        <w:tblPrEx>
-          <w:tblCellMar>
-            <w:top w:w="0" w:type="dxa"/>
-            <w:bottom w:w="0" w:type="dxa"/>
-          </w:tblCellMar>
-        </w:tblPrEx>
         <w:tc>
           <w:tcPr>
             <w:tcW w:w="900" w:type="dxa"/>
@@ -3467,12 +3236,6 @@
         </w:tc>
       </w:tr>
       <w:tr>
-        <w:tblPrEx>
-          <w:tblCellMar>
-            <w:top w:w="0" w:type="dxa"/>
-            <w:bottom w:w="0" w:type="dxa"/>
-          </w:tblCellMar>
-        </w:tblPrEx>
         <w:tc>
           <w:tcPr>
             <w:tcW w:w="900" w:type="dxa"/>
@@ -3676,12 +3439,6 @@
         </w:tc>
       </w:tr>
       <w:tr>
-        <w:tblPrEx>
-          <w:tblCellMar>
-            <w:top w:w="0" w:type="dxa"/>
-            <w:bottom w:w="0" w:type="dxa"/>
-          </w:tblCellMar>
-        </w:tblPrEx>
         <w:tc>
           <w:tcPr>
             <w:tcW w:w="900" w:type="dxa"/>
@@ -3885,12 +3642,6 @@
         </w:tc>
       </w:tr>
       <w:tr>
-        <w:tblPrEx>
-          <w:tblCellMar>
-            <w:top w:w="0" w:type="dxa"/>
-            <w:bottom w:w="0" w:type="dxa"/>
-          </w:tblCellMar>
-        </w:tblPrEx>
         <w:tc>
           <w:tcPr>
             <w:tcW w:w="900" w:type="dxa"/>
@@ -4094,12 +3845,6 @@
         </w:tc>
       </w:tr>
       <w:tr>
-        <w:tblPrEx>
-          <w:tblCellMar>
-            <w:top w:w="0" w:type="dxa"/>
-            <w:bottom w:w="0" w:type="dxa"/>
-          </w:tblCellMar>
-        </w:tblPrEx>
         <w:tc>
           <w:tcPr>
             <w:tcW w:w="900" w:type="dxa"/>
@@ -4281,12 +4026,6 @@
         </w:tc>
       </w:tr>
       <w:tr>
-        <w:tblPrEx>
-          <w:tblCellMar>
-            <w:top w:w="0" w:type="dxa"/>
-            <w:bottom w:w="0" w:type="dxa"/>
-          </w:tblCellMar>
-        </w:tblPrEx>
         <w:tc>
           <w:tcPr>
             <w:tcW w:w="900" w:type="dxa"/>
@@ -4490,12 +4229,6 @@
         </w:tc>
       </w:tr>
       <w:tr>
-        <w:tblPrEx>
-          <w:tblCellMar>
-            <w:top w:w="0" w:type="dxa"/>
-            <w:bottom w:w="0" w:type="dxa"/>
-          </w:tblCellMar>
-        </w:tblPrEx>
         <w:tc>
           <w:tcPr>
             <w:tcW w:w="900" w:type="dxa"/>
@@ -4699,12 +4432,6 @@
         </w:tc>
       </w:tr>
       <w:tr>
-        <w:tblPrEx>
-          <w:tblCellMar>
-            <w:top w:w="0" w:type="dxa"/>
-            <w:bottom w:w="0" w:type="dxa"/>
-          </w:tblCellMar>
-        </w:tblPrEx>
         <w:tc>
           <w:tcPr>
             <w:tcW w:w="900" w:type="dxa"/>
@@ -4908,12 +4635,6 @@
         </w:tc>
       </w:tr>
       <w:tr>
-        <w:tblPrEx>
-          <w:tblCellMar>
-            <w:top w:w="0" w:type="dxa"/>
-            <w:bottom w:w="0" w:type="dxa"/>
-          </w:tblCellMar>
-        </w:tblPrEx>
         <w:tc>
           <w:tcPr>
             <w:tcW w:w="900" w:type="dxa"/>
@@ -5095,12 +4816,6 @@
         </w:tc>
       </w:tr>
       <w:tr>
-        <w:tblPrEx>
-          <w:tblCellMar>
-            <w:top w:w="0" w:type="dxa"/>
-            <w:bottom w:w="0" w:type="dxa"/>
-          </w:tblCellMar>
-        </w:tblPrEx>
         <w:tc>
           <w:tcPr>
             <w:tcW w:w="900" w:type="dxa"/>
@@ -5282,12 +4997,6 @@
         </w:tc>
       </w:tr>
       <w:tr>
-        <w:tblPrEx>
-          <w:tblCellMar>
-            <w:top w:w="0" w:type="dxa"/>
-            <w:bottom w:w="0" w:type="dxa"/>
-          </w:tblCellMar>
-        </w:tblPrEx>
         <w:tc>
           <w:tcPr>
             <w:tcW w:w="900" w:type="dxa"/>
@@ -5491,12 +5200,6 @@
         </w:tc>
       </w:tr>
       <w:tr>
-        <w:tblPrEx>
-          <w:tblCellMar>
-            <w:top w:w="0" w:type="dxa"/>
-            <w:bottom w:w="0" w:type="dxa"/>
-          </w:tblCellMar>
-        </w:tblPrEx>
         <w:tc>
           <w:tcPr>
             <w:tcW w:w="900" w:type="dxa"/>
@@ -5678,12 +5381,6 @@
         </w:tc>
       </w:tr>
       <w:tr>
-        <w:tblPrEx>
-          <w:tblCellMar>
-            <w:top w:w="0" w:type="dxa"/>
-            <w:bottom w:w="0" w:type="dxa"/>
-          </w:tblCellMar>
-        </w:tblPrEx>
         <w:tc>
           <w:tcPr>
             <w:tcW w:w="900" w:type="dxa"/>
@@ -5865,12 +5562,6 @@
         </w:tc>
       </w:tr>
       <w:tr>
-        <w:tblPrEx>
-          <w:tblCellMar>
-            <w:top w:w="0" w:type="dxa"/>
-            <w:bottom w:w="0" w:type="dxa"/>
-          </w:tblCellMar>
-        </w:tblPrEx>
         <w:tc>
           <w:tcPr>
             <w:tcW w:w="900" w:type="dxa"/>
@@ -6052,12 +5743,6 @@
         </w:tc>
       </w:tr>
       <w:tr>
-        <w:tblPrEx>
-          <w:tblCellMar>
-            <w:top w:w="0" w:type="dxa"/>
-            <w:bottom w:w="0" w:type="dxa"/>
-          </w:tblCellMar>
-        </w:tblPrEx>
         <w:tc>
           <w:tcPr>
             <w:tcW w:w="900" w:type="dxa"/>
@@ -7010,7 +6695,7 @@
                     <pic:cNvPicPr/>
                   </pic:nvPicPr>
                   <pic:blipFill>
-                    <a:blip r:embed="rId10">
+                    <a:blip r:embed="rId7">
                       <a:extLst>
                         <a:ext uri="{28A0092B-C50C-407E-A947-70E740481C1C}">
                           <a14:useLocalDpi xmlns:a14="http://schemas.microsoft.com/office/drawing/2010/main" val="0"/>
@@ -8445,7 +8130,7 @@
                     <pic:cNvPicPr/>
                   </pic:nvPicPr>
                   <pic:blipFill>
-                    <a:blip r:embed="rId11" cstate="print">
+                    <a:blip r:embed="rId8" cstate="print">
                       <a:extLst>
                         <a:ext uri="{28A0092B-C50C-407E-A947-70E740481C1C}">
                           <a14:useLocalDpi xmlns:a14="http://schemas.microsoft.com/office/drawing/2010/main" val="0"/>
@@ -8559,7 +8244,7 @@
                     <pic:cNvPicPr/>
                   </pic:nvPicPr>
                   <pic:blipFill>
-                    <a:blip r:embed="rId12" cstate="print">
+                    <a:blip r:embed="rId9" cstate="print">
                       <a:extLst>
                         <a:ext uri="{28A0092B-C50C-407E-A947-70E740481C1C}">
                           <a14:useLocalDpi xmlns:a14="http://schemas.microsoft.com/office/drawing/2010/main" val="0"/>
@@ -8674,7 +8359,7 @@
                     <pic:cNvPicPr/>
                   </pic:nvPicPr>
                   <pic:blipFill>
-                    <a:blip r:embed="rId13" cstate="print">
+                    <a:blip r:embed="rId10" cstate="print">
                       <a:extLst>
                         <a:ext uri="{28A0092B-C50C-407E-A947-70E740481C1C}">
                           <a14:useLocalDpi xmlns:a14="http://schemas.microsoft.com/office/drawing/2010/main" val="0"/>
@@ -8892,7 +8577,7 @@
                     <pic:cNvPicPr/>
                   </pic:nvPicPr>
                   <pic:blipFill>
-                    <a:blip r:embed="rId14">
+                    <a:blip r:embed="rId11">
                       <a:extLst>
                         <a:ext uri="{28A0092B-C50C-407E-A947-70E740481C1C}">
                           <a14:useLocalDpi xmlns:a14="http://schemas.microsoft.com/office/drawing/2010/main" val="0"/>

</xml_diff>

<commit_message>
docs: update Figure 9.4 State Machine with crisp white-mode diagram matching Thai drawio specification
</commit_message>
<xml_diff>
--- a/docs/Software_Architecture_Design_Report_AIVES_Group3_EN.docx
+++ b/docs/Software_Architecture_Design_Report_AIVES_Group3_EN.docx
@@ -145,11 +145,7 @@
         <w:jc w:val="center"/>
       </w:pPr>
       <w:r>
-        <w:t>6</w:t>
-      </w:r>
-      <w:r>
-        <w:lastRenderedPageBreak/>
-        <w:t>.2 Workflow 2: Real-Time AI Viva Examination Room (Target Milestone 4 Flow)</w:t>
+        <w:t>6.2 Workflow 2: Real-Time AI Viva Examination Room (Target Milestone 4 Flow)</w:t>
       </w:r>
     </w:p>
     <w:p>
@@ -212,6 +208,7 @@
         <w:spacing w:before="60" w:after="80" w:line="276" w:lineRule="auto"/>
       </w:pPr>
       <w:r>
+        <w:lastRenderedPageBreak/>
         <w:t>10. Product</w:t>
       </w:r>
     </w:p>
@@ -255,6 +252,7 @@
           <w:color w:val="000000"/>
           <w:sz w:val="34"/>
         </w:rPr>
+        <w:lastRenderedPageBreak/>
         <w:t>1. Introduction</w:t>
       </w:r>
     </w:p>
@@ -8549,23 +8547,27 @@
         <w:spacing w:before="200"/>
         <w:jc w:val="center"/>
         <w:rPr>
-          <w:b/>
-          <w:color w:val="000000"/>
-          <w:sz w:val="24"/>
-        </w:rPr>
-      </w:pPr>
-      <w:r>
-        <w:rPr>
-          <w:b/>
+          <w:rFonts w:ascii="Calibri" w:hAnsi="Calibri" w:cs="Calibri"/>
+          <w:b/>
+          <w:i/>
+          <w:color w:val="000000"/>
+          <w:sz w:val="19"/>
+        </w:rPr>
+      </w:pPr>
+      <w:r>
+        <w:rPr>
+          <w:rFonts w:ascii="Calibri" w:hAnsi="Calibri" w:cs="Calibri"/>
+          <w:b/>
+          <w:i/>
           <w:noProof/>
           <w:color w:val="000000"/>
-          <w:sz w:val="24"/>
+          <w:sz w:val="19"/>
         </w:rPr>
         <w:drawing>
-          <wp:inline distT="0" distB="0" distL="0" distR="0" wp14:anchorId="49A6A4E6" wp14:editId="03B85102">
-            <wp:extent cx="5461000" cy="2554301"/>
+          <wp:inline distT="0" distB="0" distL="0" distR="0" wp14:anchorId="2E6BEF18" wp14:editId="5F3DCD07">
+            <wp:extent cx="5461000" cy="3627831"/>
             <wp:effectExtent l="0" t="0" r="6350" b="0"/>
-            <wp:docPr id="264509945" name="Picture 10"/>
+            <wp:docPr id="1744459125" name="Picture 1"/>
             <wp:cNvGraphicFramePr>
               <a:graphicFrameLocks xmlns:a="http://schemas.openxmlformats.org/drawingml/2006/main" noChangeAspect="1"/>
             </wp:cNvGraphicFramePr>
@@ -8573,11 +8575,11 @@
               <a:graphicData uri="http://schemas.openxmlformats.org/drawingml/2006/picture">
                 <pic:pic xmlns:pic="http://schemas.openxmlformats.org/drawingml/2006/picture">
                   <pic:nvPicPr>
-                    <pic:cNvPr id="264509945" name=""/>
+                    <pic:cNvPr id="1744459125" name=""/>
                     <pic:cNvPicPr/>
                   </pic:nvPicPr>
                   <pic:blipFill>
-                    <a:blip r:embed="rId11">
+                    <a:blip r:embed="rId11" cstate="print">
                       <a:extLst>
                         <a:ext uri="{28A0092B-C50C-407E-A947-70E740481C1C}">
                           <a14:useLocalDpi xmlns:a14="http://schemas.microsoft.com/office/drawing/2010/main" val="0"/>
@@ -8591,7 +8593,7 @@
                   <pic:spPr>
                     <a:xfrm>
                       <a:off x="0" y="0"/>
-                      <a:ext cx="5461000" cy="2554301"/>
+                      <a:ext cx="5461000" cy="3627831"/>
                     </a:xfrm>
                     <a:prstGeom prst="rect">
                       <a:avLst/>

</xml_diff>

<commit_message>
Restore original conceptual ERD in report
</commit_message>
<xml_diff>
--- a/docs/Software_Architecture_Design_Report_AIVES_Group3_EN.docx
+++ b/docs/Software_Architecture_Design_Report_AIVES_Group3_EN.docx
@@ -956,22 +956,27 @@
         <w:jc w:val="center"/>
       </w:pPr>
       <w:r>
+        <w:rPr>
+          <w:noProof/>
+        </w:rPr>
+        <w:lastRenderedPageBreak/>
         <w:drawing>
-          <wp:inline xmlns:a="http://schemas.openxmlformats.org/drawingml/2006/main" xmlns:pic="http://schemas.openxmlformats.org/drawingml/2006/picture">
+          <wp:inline distT="0" distB="0" distL="0" distR="0" wp14:anchorId="294860A1" wp14:editId="58AFB995">
             <wp:extent cx="5623560" cy="3624359"/>
+            <wp:effectExtent l="0" t="0" r="0" b="0"/>
             <wp:docPr id="17" name="Picture 17"/>
             <wp:cNvGraphicFramePr>
-              <a:graphicFrameLocks noChangeAspect="1"/>
+              <a:graphicFrameLocks xmlns:a="http://schemas.openxmlformats.org/drawingml/2006/main" noChangeAspect="1"/>
             </wp:cNvGraphicFramePr>
-            <a:graphic>
+            <a:graphic xmlns:a="http://schemas.openxmlformats.org/drawingml/2006/main">
               <a:graphicData uri="http://schemas.openxmlformats.org/drawingml/2006/picture">
-                <pic:pic>
+                <pic:pic xmlns:pic="http://schemas.openxmlformats.org/drawingml/2006/picture">
                   <pic:nvPicPr>
                     <pic:cNvPr id="0" name="image.png"/>
                     <pic:cNvPicPr/>
                   </pic:nvPicPr>
                   <pic:blipFill>
-                    <a:blip r:embed="rId22"/>
+                    <a:blip r:embed="rId8"/>
                     <a:stretch>
                       <a:fillRect/>
                     </a:stretch>
@@ -981,7 +986,9 @@
                       <a:off x="0" y="0"/>
                       <a:ext cx="5623560" cy="3624359"/>
                     </a:xfrm>
-                    <a:prstGeom prst="rect"/>
+                    <a:prstGeom prst="rect">
+                      <a:avLst/>
+                    </a:prstGeom>
                   </pic:spPr>
                 </pic:pic>
               </a:graphicData>
@@ -1004,22 +1011,27 @@
         <w:jc w:val="center"/>
       </w:pPr>
       <w:r>
+        <w:rPr>
+          <w:noProof/>
+        </w:rPr>
+        <w:lastRenderedPageBreak/>
         <w:drawing>
-          <wp:inline xmlns:a="http://schemas.openxmlformats.org/drawingml/2006/main" xmlns:pic="http://schemas.openxmlformats.org/drawingml/2006/picture">
+          <wp:inline distT="0" distB="0" distL="0" distR="0" wp14:anchorId="686F72B3" wp14:editId="16903A9C">
             <wp:extent cx="5623560" cy="6358590"/>
+            <wp:effectExtent l="0" t="0" r="0" b="0"/>
             <wp:docPr id="18" name="Picture 18"/>
             <wp:cNvGraphicFramePr>
-              <a:graphicFrameLocks noChangeAspect="1"/>
+              <a:graphicFrameLocks xmlns:a="http://schemas.openxmlformats.org/drawingml/2006/main" noChangeAspect="1"/>
             </wp:cNvGraphicFramePr>
-            <a:graphic>
+            <a:graphic xmlns:a="http://schemas.openxmlformats.org/drawingml/2006/main">
               <a:graphicData uri="http://schemas.openxmlformats.org/drawingml/2006/picture">
-                <pic:pic>
+                <pic:pic xmlns:pic="http://schemas.openxmlformats.org/drawingml/2006/picture">
                   <pic:nvPicPr>
                     <pic:cNvPr id="0" name="image.png"/>
                     <pic:cNvPicPr/>
                   </pic:nvPicPr>
                   <pic:blipFill>
-                    <a:blip r:embed="rId23"/>
+                    <a:blip r:embed="rId9"/>
                     <a:stretch>
                       <a:fillRect/>
                     </a:stretch>
@@ -1029,7 +1041,9 @@
                       <a:off x="0" y="0"/>
                       <a:ext cx="5623560" cy="6358590"/>
                     </a:xfrm>
-                    <a:prstGeom prst="rect"/>
+                    <a:prstGeom prst="rect">
+                      <a:avLst/>
+                    </a:prstGeom>
                   </pic:spPr>
                 </pic:pic>
               </a:graphicData>
@@ -1052,22 +1066,27 @@
         <w:jc w:val="center"/>
       </w:pPr>
       <w:r>
+        <w:rPr>
+          <w:noProof/>
+        </w:rPr>
+        <w:lastRenderedPageBreak/>
         <w:drawing>
-          <wp:inline xmlns:a="http://schemas.openxmlformats.org/drawingml/2006/main" xmlns:pic="http://schemas.openxmlformats.org/drawingml/2006/picture">
+          <wp:inline distT="0" distB="0" distL="0" distR="0" wp14:anchorId="362536A2" wp14:editId="4CADB506">
             <wp:extent cx="5623560" cy="5761778"/>
+            <wp:effectExtent l="0" t="0" r="0" b="0"/>
             <wp:docPr id="19" name="Picture 19"/>
             <wp:cNvGraphicFramePr>
-              <a:graphicFrameLocks noChangeAspect="1"/>
+              <a:graphicFrameLocks xmlns:a="http://schemas.openxmlformats.org/drawingml/2006/main" noChangeAspect="1"/>
             </wp:cNvGraphicFramePr>
-            <a:graphic>
+            <a:graphic xmlns:a="http://schemas.openxmlformats.org/drawingml/2006/main">
               <a:graphicData uri="http://schemas.openxmlformats.org/drawingml/2006/picture">
-                <pic:pic>
+                <pic:pic xmlns:pic="http://schemas.openxmlformats.org/drawingml/2006/picture">
                   <pic:nvPicPr>
                     <pic:cNvPr id="0" name="image.png"/>
                     <pic:cNvPicPr/>
                   </pic:nvPicPr>
                   <pic:blipFill>
-                    <a:blip r:embed="rId24"/>
+                    <a:blip r:embed="rId10"/>
                     <a:stretch>
                       <a:fillRect/>
                     </a:stretch>
@@ -1077,7 +1096,9 @@
                       <a:off x="0" y="0"/>
                       <a:ext cx="5623560" cy="5761778"/>
                     </a:xfrm>
-                    <a:prstGeom prst="rect"/>
+                    <a:prstGeom prst="rect">
+                      <a:avLst/>
+                    </a:prstGeom>
                   </pic:spPr>
                 </pic:pic>
               </a:graphicData>
@@ -1100,22 +1121,24 @@
         <w:jc w:val="center"/>
       </w:pPr>
       <w:r>
+        <w:lastRenderedPageBreak/>
         <w:drawing>
-          <wp:inline xmlns:a="http://schemas.openxmlformats.org/drawingml/2006/main" xmlns:pic="http://schemas.openxmlformats.org/drawingml/2006/picture">
-            <wp:extent cx="5623560" cy="5811012"/>
-            <wp:docPr id="20" name="Picture 20"/>
+          <wp:inline distT="0" distB="0" distL="0" distR="0" wp14:anchorId="48491F6C" wp14:editId="387BA643">
+            <wp:extent cx="6346190" cy="5165725"/>
+            <wp:effectExtent l="0" t="0" r="0" b="0"/>
+            <wp:docPr id="1958857753" name="Picture 1"/>
             <wp:cNvGraphicFramePr>
-              <a:graphicFrameLocks noChangeAspect="1"/>
+              <a:graphicFrameLocks xmlns:a="http://schemas.openxmlformats.org/drawingml/2006/main" noChangeAspect="1"/>
             </wp:cNvGraphicFramePr>
-            <a:graphic>
+            <a:graphic xmlns:a="http://schemas.openxmlformats.org/drawingml/2006/main">
               <a:graphicData uri="http://schemas.openxmlformats.org/drawingml/2006/picture">
-                <pic:pic>
+                <pic:pic xmlns:pic="http://schemas.openxmlformats.org/drawingml/2006/picture">
                   <pic:nvPicPr>
-                    <pic:cNvPr id="0" name="2_UseCase_Diagram.png"/>
+                    <pic:cNvPr id="1958857753" name=""/>
                     <pic:cNvPicPr/>
                   </pic:nvPicPr>
                   <pic:blipFill>
-                    <a:blip r:embed="rId25"/>
+                    <a:blip r:embed="rId11"/>
                     <a:stretch>
                       <a:fillRect/>
                     </a:stretch>
@@ -1123,9 +1146,11 @@
                   <pic:spPr>
                     <a:xfrm>
                       <a:off x="0" y="0"/>
-                      <a:ext cx="5623560" cy="5811012"/>
+                      <a:ext cx="6346190" cy="5165725"/>
                     </a:xfrm>
-                    <a:prstGeom prst="rect"/>
+                    <a:prstGeom prst="rect">
+                      <a:avLst/>
+                    </a:prstGeom>
                   </pic:spPr>
                 </pic:pic>
               </a:graphicData>
@@ -2513,21 +2538,22 @@
       </w:pPr>
       <w:r>
         <w:drawing>
-          <wp:inline xmlns:a="http://schemas.openxmlformats.org/drawingml/2006/main" xmlns:pic="http://schemas.openxmlformats.org/drawingml/2006/picture">
-            <wp:extent cx="5623560" cy="4562976"/>
-            <wp:docPr id="21" name="Picture 21"/>
+          <wp:inline distT="0" distB="0" distL="0" distR="0" wp14:anchorId="2406127C" wp14:editId="7AADC016">
+            <wp:extent cx="6346190" cy="3494405"/>
+            <wp:effectExtent l="0" t="0" r="0" b="0"/>
+            <wp:docPr id="1293756254" name="Picture 1"/>
             <wp:cNvGraphicFramePr>
-              <a:graphicFrameLocks noChangeAspect="1"/>
+              <a:graphicFrameLocks xmlns:a="http://schemas.openxmlformats.org/drawingml/2006/main" noChangeAspect="1"/>
             </wp:cNvGraphicFramePr>
-            <a:graphic>
+            <a:graphic xmlns:a="http://schemas.openxmlformats.org/drawingml/2006/main">
               <a:graphicData uri="http://schemas.openxmlformats.org/drawingml/2006/picture">
-                <pic:pic>
+                <pic:pic xmlns:pic="http://schemas.openxmlformats.org/drawingml/2006/picture">
                   <pic:nvPicPr>
-                    <pic:cNvPr id="0" name="10_StateMachine_Question.png"/>
+                    <pic:cNvPr id="1293756254" name=""/>
                     <pic:cNvPicPr/>
                   </pic:nvPicPr>
                   <pic:blipFill>
-                    <a:blip r:embed="rId26"/>
+                    <a:blip r:embed="rId12"/>
                     <a:stretch>
                       <a:fillRect/>
                     </a:stretch>
@@ -2535,9 +2561,11 @@
                   <pic:spPr>
                     <a:xfrm>
                       <a:off x="0" y="0"/>
-                      <a:ext cx="5623560" cy="4562976"/>
+                      <a:ext cx="6346190" cy="3494405"/>
                     </a:xfrm>
-                    <a:prstGeom prst="rect"/>
+                    <a:prstGeom prst="rect">
+                      <a:avLst/>
+                    </a:prstGeom>
                   </pic:spPr>
                 </pic:pic>
               </a:graphicData>
@@ -2590,8 +2618,8 @@
       <w:r>
         <w:drawing>
           <wp:inline xmlns:a="http://schemas.openxmlformats.org/drawingml/2006/main" xmlns:pic="http://schemas.openxmlformats.org/drawingml/2006/picture">
-            <wp:extent cx="5623560" cy="3983355"/>
-            <wp:docPr id="22" name="Picture 22"/>
+            <wp:extent cx="5623560" cy="3123683"/>
+            <wp:docPr id="1958857754" name="Picture 1958857754"/>
             <wp:cNvGraphicFramePr>
               <a:graphicFrameLocks noChangeAspect="1"/>
             </wp:cNvGraphicFramePr>
@@ -2599,11 +2627,11 @@
               <a:graphicData uri="http://schemas.openxmlformats.org/drawingml/2006/picture">
                 <pic:pic>
                   <pic:nvPicPr>
-                    <pic:cNvPr id="0" name="image.png"/>
+                    <pic:cNvPr id="0" name="6_Conceptual_ERD.png"/>
                     <pic:cNvPicPr/>
                   </pic:nvPicPr>
                   <pic:blipFill>
-                    <a:blip r:embed="rId21"/>
+                    <a:blip r:embed="rId18"/>
                     <a:stretch>
                       <a:fillRect/>
                     </a:stretch>
@@ -2611,7 +2639,7 @@
                   <pic:spPr>
                     <a:xfrm>
                       <a:off x="0" y="0"/>
-                      <a:ext cx="5623560" cy="3983355"/>
+                      <a:ext cx="5623560" cy="3123683"/>
                     </a:xfrm>
                     <a:prstGeom prst="rect"/>
                   </pic:spPr>
@@ -2747,6 +2775,7 @@
         <w:pStyle w:val="ListBullet"/>
       </w:pPr>
       <w:r>
+        <w:lastRenderedPageBreak/>
         <w:t>BACKEND_CONTRACTS.md and BACKEND_PROGRESS.md — implementation contract and progress records.</w:t>
       </w:r>
     </w:p>

</xml_diff>

<commit_message>
Keep original ERD layout and remove key fields
</commit_message>
<xml_diff>
--- a/docs/Software_Architecture_Design_Report_AIVES_Group3_EN.docx
+++ b/docs/Software_Architecture_Design_Report_AIVES_Group3_EN.docx
@@ -2618,7 +2618,7 @@
       <w:r>
         <w:drawing>
           <wp:inline xmlns:a="http://schemas.openxmlformats.org/drawingml/2006/main" xmlns:pic="http://schemas.openxmlformats.org/drawingml/2006/picture">
-            <wp:extent cx="5623560" cy="3123683"/>
+            <wp:extent cx="5623560" cy="3128338"/>
             <wp:docPr id="1958857754" name="Picture 1958857754"/>
             <wp:cNvGraphicFramePr>
               <a:graphicFrameLocks noChangeAspect="1"/>
@@ -2631,7 +2631,7 @@
                     <pic:cNvPicPr/>
                   </pic:nvPicPr>
                   <pic:blipFill>
-                    <a:blip r:embed="rId18"/>
+                    <a:blip r:embed="rId20"/>
                     <a:stretch>
                       <a:fillRect/>
                     </a:stretch>
@@ -2639,7 +2639,7 @@
                   <pic:spPr>
                     <a:xfrm>
                       <a:off x="0" y="0"/>
-                      <a:ext cx="5623560" cy="3123683"/>
+                      <a:ext cx="5623560" cy="3128338"/>
                     </a:xfrm>
                     <a:prstGeom prst="rect"/>
                   </pic:spPr>
@@ -2655,7 +2655,7 @@
         <w:jc w:val="center"/>
       </w:pPr>
       <w:r>
-        <w:t>Figure 5. Revised conceptual ERD for the target examination model</w:t>
+        <w:t>Figure 5. Conceptual ERD for the AIVES system</w:t>
       </w:r>
     </w:p>
     <w:p>

</xml_diff>

<commit_message>
Restore conceptual ERD and update English report figure
</commit_message>
<xml_diff>
--- a/docs/Software_Architecture_Design_Report_AIVES_Group3_EN.docx
+++ b/docs/Software_Architecture_Design_Report_AIVES_Group3_EN.docx
@@ -1121,6 +1121,9 @@
         <w:jc w:val="center"/>
       </w:pPr>
       <w:r>
+        <w:rPr>
+          <w:noProof/>
+        </w:rPr>
         <w:lastRenderedPageBreak/>
         <w:drawing>
           <wp:inline distT="0" distB="0" distL="0" distR="0" wp14:anchorId="48491F6C" wp14:editId="387BA643">
@@ -2537,6 +2540,9 @@
         <w:jc w:val="center"/>
       </w:pPr>
       <w:r>
+        <w:rPr>
+          <w:noProof/>
+        </w:rPr>
         <w:drawing>
           <wp:inline distT="0" distB="0" distL="0" distR="0" wp14:anchorId="2406127C" wp14:editId="7AADC016">
             <wp:extent cx="6346190" cy="3494405"/>
@@ -2617,21 +2623,22 @@
       </w:pPr>
       <w:r>
         <w:drawing>
-          <wp:inline xmlns:a="http://schemas.openxmlformats.org/drawingml/2006/main" xmlns:pic="http://schemas.openxmlformats.org/drawingml/2006/picture">
-            <wp:extent cx="5623560" cy="3128338"/>
-            <wp:docPr id="1958857754" name="Picture 1958857754"/>
+          <wp:inline distT="0" distB="0" distL="0" distR="0" wp14:anchorId="6A32A1DF" wp14:editId="14F66DCD">
+            <wp:extent cx="6346190" cy="3738880"/>
+            <wp:effectExtent l="0" t="0" r="0" b="0"/>
+            <wp:docPr id="822327241" name="Picture 1"/>
             <wp:cNvGraphicFramePr>
-              <a:graphicFrameLocks noChangeAspect="1"/>
+              <a:graphicFrameLocks xmlns:a="http://schemas.openxmlformats.org/drawingml/2006/main" noChangeAspect="1"/>
             </wp:cNvGraphicFramePr>
-            <a:graphic>
+            <a:graphic xmlns:a="http://schemas.openxmlformats.org/drawingml/2006/main">
               <a:graphicData uri="http://schemas.openxmlformats.org/drawingml/2006/picture">
-                <pic:pic>
+                <pic:pic xmlns:pic="http://schemas.openxmlformats.org/drawingml/2006/picture">
                   <pic:nvPicPr>
-                    <pic:cNvPr id="0" name="6_Conceptual_ERD.png"/>
+                    <pic:cNvPr id="822327241" name=""/>
                     <pic:cNvPicPr/>
                   </pic:nvPicPr>
                   <pic:blipFill>
-                    <a:blip r:embed="rId20"/>
+                    <a:blip r:embed="rId13"/>
                     <a:stretch>
                       <a:fillRect/>
                     </a:stretch>
@@ -2639,9 +2646,11 @@
                   <pic:spPr>
                     <a:xfrm>
                       <a:off x="0" y="0"/>
-                      <a:ext cx="5623560" cy="3128338"/>
+                      <a:ext cx="6346190" cy="3738880"/>
                     </a:xfrm>
-                    <a:prstGeom prst="rect"/>
+                    <a:prstGeom prst="rect">
+                      <a:avLst/>
+                    </a:prstGeom>
                   </pic:spPr>
                 </pic:pic>
               </a:graphicData>
@@ -2775,7 +2784,6 @@
         <w:pStyle w:val="ListBullet"/>
       </w:pPr>
       <w:r>
-        <w:lastRenderedPageBreak/>
         <w:t>BACKEND_CONTRACTS.md and BACKEND_PROGRESS.md — implementation contract and progress records.</w:t>
       </w:r>
     </w:p>

</xml_diff>